<commit_message>
Add sponsor thank-you (Improving, Mobiik, Svitla) to findings outputs
Thank-you note + three logos in three places:
- scrollytelling site footer (white chips, legible in light and dark)
- report final page (report.html -> regenerated PDF)
- a closing "Gracias" page in the media-stories Word doc (regenerated)

Logos committed under campaign/findings-site/logos/.

Co-Authored-By: Claude Opus 4.8 <noreply@anthropic.com>
</commit_message>
<xml_diff>
--- a/docs/media-stories/SG-Tech-Pulse-2026-Historias-para-medios.docx
+++ b/docs/media-stories/SG-Tech-Pulse-2026-Historias-para-medios.docx
@@ -5219,6 +5219,247 @@
         <w:br w:type="page"/>
       </w:r>
     </w:p>
+    <w:p>
+      <w:pPr>
+        <w:spacing w:after="140" w:before="2400"/>
+        <w:jc w:val="center"/>
+      </w:pPr>
+      <w:r>
+        <w:rPr>
+          <w:rFonts w:ascii="Calibri" w:cs="Calibri" w:eastAsia="Calibri" w:hAnsi="Calibri"/>
+          <w:b/>
+          <w:bCs/>
+          <w:color w:val="6B3DFA"/>
+          <w:sz w:val="34"/>
+          <w:szCs w:val="34"/>
+        </w:rPr>
+        <w:t xml:space="preserve">Gracias</w:t>
+      </w:r>
+    </w:p>
+    <w:p>
+      <w:pPr>
+        <w:spacing w:after="500"/>
+        <w:jc w:val="center"/>
+      </w:pPr>
+      <w:r>
+        <w:rPr>
+          <w:rFonts w:ascii="Calibri" w:cs="Calibri" w:eastAsia="Calibri" w:hAnsi="Calibri"/>
+          <w:color w:val="1A1A1A"/>
+          <w:sz w:val="22"/>
+          <w:szCs w:val="22"/>
+        </w:rPr>
+        <w:t xml:space="preserve">Gracias a Improving, Mobiik y Svitla por difundir esta encuesta en la comunidad tech.</w:t>
+      </w:r>
+    </w:p>
+    <w:tbl>
+      <w:tblPr>
+        <w:tblW w:type="pct" w:w="5000"/>
+        <w:tblBorders>
+          <w:top w:val="none" w:color="FFFFFF" w:sz="0"/>
+          <w:left w:val="none" w:color="FFFFFF" w:sz="0"/>
+          <w:bottom w:val="none" w:color="FFFFFF" w:sz="0"/>
+          <w:right w:val="none" w:color="FFFFFF" w:sz="0"/>
+          <w:insideH w:val="none" w:color="FFFFFF" w:sz="0"/>
+          <w:insideV w:val="none" w:color="FFFFFF" w:sz="0"/>
+        </w:tblBorders>
+      </w:tblPr>
+      <w:tblGrid>
+        <w:gridCol w:w="3089"/>
+        <w:gridCol w:w="3089"/>
+        <w:gridCol w:w="3089"/>
+      </w:tblGrid>
+      <w:tr>
+        <w:tc>
+          <w:tcPr>
+            <w:tcW w:type="pct" w:w="1650"/>
+            <w:tcBorders>
+              <w:top w:val="none" w:color="FFFFFF" w:sz="0"/>
+              <w:left w:val="none" w:color="FFFFFF" w:sz="0"/>
+              <w:bottom w:val="none" w:color="FFFFFF" w:sz="0"/>
+              <w:right w:val="none" w:color="FFFFFF" w:sz="0"/>
+            </w:tcBorders>
+            <w:tcMar>
+              <w:top w:type="dxa" w:w="80"/>
+              <w:left w:type="dxa" w:w="80"/>
+              <w:bottom w:type="dxa" w:w="80"/>
+              <w:right w:type="dxa" w:w="80"/>
+            </w:tcMar>
+            <w:vAlign w:val="center"/>
+          </w:tcPr>
+          <w:p>
+            <w:pPr>
+              <w:jc w:val="center"/>
+            </w:pPr>
+            <w:r>
+              <w:drawing>
+                <wp:inline distT="0" distB="0" distL="0" distR="0">
+                  <wp:extent cx="1143000" cy="571500"/>
+                  <wp:effectExtent t="0" r="0" b="0" l="0"/>
+                  <wp:docPr id="1" name="" descr="" title=""/>
+                  <wp:cNvGraphicFramePr>
+                    <a:graphicFrameLocks xmlns:a="http://schemas.openxmlformats.org/drawingml/2006/main" noChangeAspect="1"/>
+                  </wp:cNvGraphicFramePr>
+                  <a:graphic xmlns:a="http://schemas.openxmlformats.org/drawingml/2006/main">
+                    <a:graphicData uri="http://schemas.openxmlformats.org/drawingml/2006/picture">
+                      <pic:pic xmlns:pic="http://schemas.openxmlformats.org/drawingml/2006/picture">
+                        <pic:nvPicPr>
+                          <pic:cNvPr id="0" name="" descr=""/>
+                          <pic:cNvPicPr>
+                            <a:picLocks noChangeAspect="1" noChangeArrowheads="1"/>
+                          </pic:cNvPicPr>
+                        </pic:nvPicPr>
+                        <pic:blipFill>
+                          <a:blip r:embed="rId7" cstate="none"/>
+                          <a:srcRect/>
+                          <a:stretch>
+                            <a:fillRect/>
+                          </a:stretch>
+                        </pic:blipFill>
+                        <pic:spPr bwMode="auto">
+                          <a:xfrm>
+                            <a:off x="0" y="0"/>
+                            <a:ext cx="1143000" cy="571500"/>
+                          </a:xfrm>
+                          <a:prstGeom prst="rect">
+                            <a:avLst/>
+                          </a:prstGeom>
+                        </pic:spPr>
+                      </pic:pic>
+                    </a:graphicData>
+                  </a:graphic>
+                </wp:inline>
+              </w:drawing>
+            </w:r>
+          </w:p>
+        </w:tc>
+        <w:tc>
+          <w:tcPr>
+            <w:tcW w:type="pct" w:w="1650"/>
+            <w:tcBorders>
+              <w:top w:val="none" w:color="FFFFFF" w:sz="0"/>
+              <w:left w:val="none" w:color="FFFFFF" w:sz="0"/>
+              <w:bottom w:val="none" w:color="FFFFFF" w:sz="0"/>
+              <w:right w:val="none" w:color="FFFFFF" w:sz="0"/>
+            </w:tcBorders>
+            <w:tcMar>
+              <w:top w:type="dxa" w:w="80"/>
+              <w:left w:type="dxa" w:w="80"/>
+              <w:bottom w:type="dxa" w:w="80"/>
+              <w:right w:type="dxa" w:w="80"/>
+            </w:tcMar>
+            <w:vAlign w:val="center"/>
+          </w:tcPr>
+          <w:p>
+            <w:pPr>
+              <w:jc w:val="center"/>
+            </w:pPr>
+            <w:r>
+              <w:drawing>
+                <wp:inline distT="0" distB="0" distL="0" distR="0">
+                  <wp:extent cx="571500" cy="571500"/>
+                  <wp:effectExtent t="0" r="0" b="0" l="0"/>
+                  <wp:docPr id="2" name="" descr="" title=""/>
+                  <wp:cNvGraphicFramePr>
+                    <a:graphicFrameLocks xmlns:a="http://schemas.openxmlformats.org/drawingml/2006/main" noChangeAspect="1"/>
+                  </wp:cNvGraphicFramePr>
+                  <a:graphic xmlns:a="http://schemas.openxmlformats.org/drawingml/2006/main">
+                    <a:graphicData uri="http://schemas.openxmlformats.org/drawingml/2006/picture">
+                      <pic:pic xmlns:pic="http://schemas.openxmlformats.org/drawingml/2006/picture">
+                        <pic:nvPicPr>
+                          <pic:cNvPr id="0" name="" descr=""/>
+                          <pic:cNvPicPr>
+                            <a:picLocks noChangeAspect="1" noChangeArrowheads="1"/>
+                          </pic:cNvPicPr>
+                        </pic:nvPicPr>
+                        <pic:blipFill>
+                          <a:blip r:embed="rId8" cstate="none"/>
+                          <a:srcRect/>
+                          <a:stretch>
+                            <a:fillRect/>
+                          </a:stretch>
+                        </pic:blipFill>
+                        <pic:spPr bwMode="auto">
+                          <a:xfrm>
+                            <a:off x="0" y="0"/>
+                            <a:ext cx="571500" cy="571500"/>
+                          </a:xfrm>
+                          <a:prstGeom prst="rect">
+                            <a:avLst/>
+                          </a:prstGeom>
+                        </pic:spPr>
+                      </pic:pic>
+                    </a:graphicData>
+                  </a:graphic>
+                </wp:inline>
+              </w:drawing>
+            </w:r>
+          </w:p>
+        </w:tc>
+        <w:tc>
+          <w:tcPr>
+            <w:tcW w:type="pct" w:w="1650"/>
+            <w:tcBorders>
+              <w:top w:val="none" w:color="FFFFFF" w:sz="0"/>
+              <w:left w:val="none" w:color="FFFFFF" w:sz="0"/>
+              <w:bottom w:val="none" w:color="FFFFFF" w:sz="0"/>
+              <w:right w:val="none" w:color="FFFFFF" w:sz="0"/>
+            </w:tcBorders>
+            <w:tcMar>
+              <w:top w:type="dxa" w:w="80"/>
+              <w:left w:type="dxa" w:w="80"/>
+              <w:bottom w:type="dxa" w:w="80"/>
+              <w:right w:type="dxa" w:w="80"/>
+            </w:tcMar>
+            <w:vAlign w:val="center"/>
+          </w:tcPr>
+          <w:p>
+            <w:pPr>
+              <w:jc w:val="center"/>
+            </w:pPr>
+            <w:r>
+              <w:drawing>
+                <wp:inline distT="0" distB="0" distL="0" distR="0">
+                  <wp:extent cx="1143000" cy="571500"/>
+                  <wp:effectExtent t="0" r="0" b="0" l="0"/>
+                  <wp:docPr id="3" name="" descr="" title=""/>
+                  <wp:cNvGraphicFramePr>
+                    <a:graphicFrameLocks xmlns:a="http://schemas.openxmlformats.org/drawingml/2006/main" noChangeAspect="1"/>
+                  </wp:cNvGraphicFramePr>
+                  <a:graphic xmlns:a="http://schemas.openxmlformats.org/drawingml/2006/main">
+                    <a:graphicData uri="http://schemas.openxmlformats.org/drawingml/2006/picture">
+                      <pic:pic xmlns:pic="http://schemas.openxmlformats.org/drawingml/2006/picture">
+                        <pic:nvPicPr>
+                          <pic:cNvPr id="0" name="" descr=""/>
+                          <pic:cNvPicPr>
+                            <a:picLocks noChangeAspect="1" noChangeArrowheads="1"/>
+                          </pic:cNvPicPr>
+                        </pic:nvPicPr>
+                        <pic:blipFill>
+                          <a:blip r:embed="rId9" cstate="none"/>
+                          <a:srcRect/>
+                          <a:stretch>
+                            <a:fillRect/>
+                          </a:stretch>
+                        </pic:blipFill>
+                        <pic:spPr bwMode="auto">
+                          <a:xfrm>
+                            <a:off x="0" y="0"/>
+                            <a:ext cx="1143000" cy="571500"/>
+                          </a:xfrm>
+                          <a:prstGeom prst="rect">
+                            <a:avLst/>
+                          </a:prstGeom>
+                        </pic:spPr>
+                      </pic:pic>
+                    </a:graphicData>
+                  </a:graphic>
+                </wp:inline>
+              </w:drawing>
+            </w:r>
+          </w:p>
+        </w:tc>
+      </w:tr>
+    </w:tbl>
     <w:sectPr>
       <w:pgSz w:w="12240" w:h="15840" w:orient="portrait"/>
       <w:pgMar w:top="1440" w:right="1440" w:bottom="1440" w:left="1440" w:header="708" w:footer="708" w:gutter="0"/>

</xml_diff>